<commit_message>
Lajos made changes to the motivation
</commit_message>
<xml_diff>
--- a/Motivation_letter_PhD_Aneuploidy_Clin Vet_UU.docx
+++ b/Motivation_letter_PhD_Aneuploidy_Clin Vet_UU.docx
@@ -60,6 +60,176 @@
     </w:p>
     <w:p>
       <w:pPr>
+        <w:jc w:val="both"/>
+        <w:rPr>
+          <w:rFonts w:ascii="Times New Roman" w:hAnsi="Times New Roman" w:cs="Times New Roman"/>
+        </w:rPr>
+      </w:pPr>
+      <w:r>
+        <w:rPr>
+          <w:rFonts w:ascii="Times New Roman" w:hAnsi="Times New Roman" w:cs="Times New Roman"/>
+        </w:rPr>
+        <w:t>My name is Varvara Lazarenko, and I would like to express my</w:t>
+      </w:r>
+      <w:r>
+        <w:rPr>
+          <w:rFonts w:ascii="Times New Roman" w:hAnsi="Times New Roman" w:cs="Times New Roman"/>
+        </w:rPr>
+        <w:t xml:space="preserve"> strong</w:t>
+      </w:r>
+      <w:r>
+        <w:rPr>
+          <w:rFonts w:ascii="Times New Roman" w:hAnsi="Times New Roman" w:cs="Times New Roman"/>
+        </w:rPr>
+        <w:t xml:space="preserve"> interest in </w:t>
+      </w:r>
+      <w:r>
+        <w:rPr>
+          <w:rFonts w:ascii="Times New Roman" w:hAnsi="Times New Roman" w:cs="Times New Roman"/>
+        </w:rPr>
+        <w:t xml:space="preserve">the </w:t>
+      </w:r>
+      <w:r>
+        <w:rPr>
+          <w:rFonts w:ascii="Times New Roman" w:hAnsi="Times New Roman" w:cs="Times New Roman"/>
+        </w:rPr>
+        <w:t xml:space="preserve">PhD position </w:t>
+      </w:r>
+      <w:r>
+        <w:rPr>
+          <w:rFonts w:ascii="Times New Roman" w:hAnsi="Times New Roman" w:cs="Times New Roman"/>
+        </w:rPr>
+        <w:t>in Aneuploidy in Mammalian Embryos / Clinical Veterinary Embryologist</w:t>
+      </w:r>
+      <w:r>
+        <w:rPr>
+          <w:rFonts w:ascii="Times New Roman" w:hAnsi="Times New Roman" w:cs="Times New Roman"/>
+        </w:rPr>
+        <w:t xml:space="preserve">. </w:t>
+      </w:r>
+      <w:r>
+        <w:rPr>
+          <w:rFonts w:ascii="Times New Roman" w:hAnsi="Times New Roman" w:cs="Times New Roman"/>
+        </w:rPr>
+        <w:t>Th</w:t>
+      </w:r>
+      <w:r>
+        <w:rPr>
+          <w:rFonts w:ascii="Times New Roman" w:hAnsi="Times New Roman" w:cs="Times New Roman"/>
+        </w:rPr>
+        <w:t xml:space="preserve">is inspiring position </w:t>
+      </w:r>
+      <w:r>
+        <w:rPr>
+          <w:rFonts w:ascii="Times New Roman" w:hAnsi="Times New Roman" w:cs="Times New Roman"/>
+        </w:rPr>
+        <w:t xml:space="preserve">perfectly </w:t>
+      </w:r>
+      <w:r>
+        <w:rPr>
+          <w:rFonts w:ascii="Times New Roman" w:hAnsi="Times New Roman" w:cs="Times New Roman"/>
+        </w:rPr>
+        <w:t xml:space="preserve">matches my </w:t>
+      </w:r>
+      <w:r>
+        <w:rPr>
+          <w:rFonts w:ascii="Times New Roman" w:hAnsi="Times New Roman" w:cs="Times New Roman"/>
+        </w:rPr>
+        <w:t>long-standing interest in biology</w:t>
+      </w:r>
+      <w:r>
+        <w:rPr>
+          <w:rFonts w:ascii="Times New Roman" w:hAnsi="Times New Roman" w:cs="Times New Roman"/>
+        </w:rPr>
+        <w:t xml:space="preserve"> </w:t>
+      </w:r>
+      <w:r>
+        <w:rPr>
+          <w:rFonts w:ascii="Times New Roman" w:hAnsi="Times New Roman" w:cs="Times New Roman"/>
+        </w:rPr>
+        <w:t xml:space="preserve">and my passion for </w:t>
+      </w:r>
+      <w:r>
+        <w:rPr>
+          <w:rFonts w:ascii="Times New Roman" w:hAnsi="Times New Roman" w:cs="Times New Roman"/>
+        </w:rPr>
+        <w:t>animal</w:t>
+      </w:r>
+      <w:r>
+        <w:rPr>
+          <w:rFonts w:ascii="Times New Roman" w:hAnsi="Times New Roman" w:cs="Times New Roman"/>
+        </w:rPr>
+        <w:t xml:space="preserve"> sciences</w:t>
+      </w:r>
+      <w:r>
+        <w:rPr>
+          <w:rFonts w:ascii="Times New Roman" w:hAnsi="Times New Roman" w:cs="Times New Roman"/>
+        </w:rPr>
+        <w:t xml:space="preserve">. Therefore, </w:t>
+      </w:r>
+      <w:r>
+        <w:rPr>
+          <w:rFonts w:ascii="Times New Roman" w:hAnsi="Times New Roman" w:cs="Times New Roman"/>
+        </w:rPr>
+        <w:t>I believe I can bring real value</w:t>
+      </w:r>
+      <w:r>
+        <w:rPr>
+          <w:rFonts w:ascii="Times New Roman" w:hAnsi="Times New Roman" w:cs="Times New Roman"/>
+        </w:rPr>
+        <w:t xml:space="preserve"> to the project</w:t>
+      </w:r>
+      <w:r>
+        <w:rPr>
+          <w:rFonts w:ascii="Times New Roman" w:hAnsi="Times New Roman" w:cs="Times New Roman"/>
+        </w:rPr>
+        <w:t xml:space="preserve"> through both my </w:t>
+      </w:r>
+      <w:r>
+        <w:rPr>
+          <w:rFonts w:ascii="Times New Roman" w:hAnsi="Times New Roman" w:cs="Times New Roman"/>
+        </w:rPr>
+        <w:t>education</w:t>
+      </w:r>
+      <w:r>
+        <w:rPr>
+          <w:rFonts w:ascii="Times New Roman" w:hAnsi="Times New Roman" w:cs="Times New Roman"/>
+        </w:rPr>
+        <w:t xml:space="preserve"> and hands-on experience, which have prepared me well </w:t>
+      </w:r>
+      <w:r>
+        <w:rPr>
+          <w:rFonts w:ascii="Times New Roman" w:hAnsi="Times New Roman" w:cs="Times New Roman"/>
+        </w:rPr>
+        <w:t>to study t</w:t>
+      </w:r>
+      <w:r>
+        <w:rPr>
+          <w:rFonts w:ascii="Times New Roman" w:hAnsi="Times New Roman" w:cs="Times New Roman"/>
+        </w:rPr>
+        <w:t>he challenges of translational embryology</w:t>
+      </w:r>
+      <w:r>
+        <w:rPr>
+          <w:rFonts w:ascii="Times New Roman" w:hAnsi="Times New Roman" w:cs="Times New Roman"/>
+        </w:rPr>
+        <w:t xml:space="preserve"> and</w:t>
+      </w:r>
+      <w:r>
+        <w:rPr>
+          <w:rFonts w:ascii="Times New Roman" w:hAnsi="Times New Roman" w:cs="Times New Roman"/>
+        </w:rPr>
+        <w:t xml:space="preserve"> reproductive genetics</w:t>
+      </w:r>
+      <w:r>
+        <w:rPr>
+          <w:rFonts w:ascii="Times New Roman" w:hAnsi="Times New Roman" w:cs="Times New Roman"/>
+        </w:rPr>
+        <w:t>.</w:t>
+      </w:r>
+    </w:p>
+    <w:p>
+      <w:pPr>
         <w:spacing w:before="240" w:after="240"/>
         <w:jc w:val="both"/>
         <w:rPr>
@@ -70,37 +240,7 @@
         <w:rPr>
           <w:rFonts w:ascii="Times New Roman" w:hAnsi="Times New Roman" w:cs="Times New Roman"/>
         </w:rPr>
-        <w:t>My name is Varvara Lazarenko, and I would like to express my</w:t>
-      </w:r>
-      <w:r>
-        <w:rPr>
-          <w:rFonts w:ascii="Times New Roman" w:hAnsi="Times New Roman" w:cs="Times New Roman"/>
-        </w:rPr>
-        <w:t xml:space="preserve"> strong</w:t>
-      </w:r>
-      <w:r>
-        <w:rPr>
-          <w:rFonts w:ascii="Times New Roman" w:hAnsi="Times New Roman" w:cs="Times New Roman"/>
-        </w:rPr>
-        <w:t xml:space="preserve"> interest in </w:t>
-      </w:r>
-      <w:r>
-        <w:rPr>
-          <w:rFonts w:ascii="Times New Roman" w:hAnsi="Times New Roman" w:cs="Times New Roman"/>
-        </w:rPr>
-        <w:t xml:space="preserve">the </w:t>
-      </w:r>
-      <w:r>
-        <w:rPr>
-          <w:rFonts w:ascii="Times New Roman" w:hAnsi="Times New Roman" w:cs="Times New Roman"/>
-        </w:rPr>
-        <w:t xml:space="preserve">PhD position </w:t>
-      </w:r>
-      <w:r>
-        <w:rPr>
-          <w:rFonts w:ascii="Times New Roman" w:hAnsi="Times New Roman" w:cs="Times New Roman"/>
-        </w:rPr>
-        <w:t>in Aneuploidy in Mammalian Embryos / Clinical Veterinary Embryologist</w:t>
+        <w:t>I hold a BSc in Biology and an MSc in Medical Biology, where I gained a solid biomedical foundation and critical insight into medical technologies and biomedical challenges</w:t>
       </w:r>
       <w:r>
         <w:rPr>
@@ -112,7 +252,91 @@
         <w:rPr>
           <w:rFonts w:ascii="Times New Roman" w:hAnsi="Times New Roman" w:cs="Times New Roman"/>
         </w:rPr>
-        <w:t>The combination of translational embryology, reproductive genetics, and clinical application speaks directly to my academic background, hands-on research experience, and personal aspirations. This unique position aligns with my long-standing interest in biology and my passion for equine sciences.</w:t>
+        <w:t>During my studies, I built a broad set of wet lab skills</w:t>
+      </w:r>
+      <w:r>
+        <w:rPr>
+          <w:rFonts w:ascii="Times New Roman" w:hAnsi="Times New Roman" w:cs="Times New Roman"/>
+        </w:rPr>
+        <w:t>, including PCR</w:t>
+      </w:r>
+      <w:r>
+        <w:rPr>
+          <w:rFonts w:ascii="Times New Roman" w:hAnsi="Times New Roman" w:cs="Times New Roman"/>
+        </w:rPr>
+        <w:t xml:space="preserve"> and qPCR</w:t>
+      </w:r>
+      <w:r>
+        <w:rPr>
+          <w:rFonts w:ascii="Times New Roman" w:hAnsi="Times New Roman" w:cs="Times New Roman"/>
+        </w:rPr>
+        <w:t>, gel electrophoresis, RNA</w:t>
+      </w:r>
+      <w:r>
+        <w:rPr>
+          <w:rFonts w:ascii="Times New Roman" w:hAnsi="Times New Roman" w:cs="Times New Roman"/>
+        </w:rPr>
+        <w:t xml:space="preserve"> and DNA</w:t>
+      </w:r>
+      <w:r>
+        <w:rPr>
+          <w:rFonts w:ascii="Times New Roman" w:hAnsi="Times New Roman" w:cs="Times New Roman"/>
+        </w:rPr>
+        <w:t xml:space="preserve"> extraction, </w:t>
+      </w:r>
+      <w:r>
+        <w:rPr>
+          <w:rFonts w:ascii="Times New Roman" w:hAnsi="Times New Roman" w:cs="Times New Roman"/>
+        </w:rPr>
+        <w:t>enzyme-linked immunosorbent assay</w:t>
+      </w:r>
+      <w:r>
+        <w:rPr>
+          <w:rFonts w:ascii="Times New Roman" w:hAnsi="Times New Roman" w:cs="Times New Roman"/>
+        </w:rPr>
+        <w:t xml:space="preserve"> (</w:t>
+      </w:r>
+      <w:r>
+        <w:rPr>
+          <w:rFonts w:ascii="Times New Roman" w:hAnsi="Times New Roman" w:cs="Times New Roman"/>
+        </w:rPr>
+        <w:t>ELISA</w:t>
+      </w:r>
+      <w:r>
+        <w:rPr>
+          <w:rFonts w:ascii="Times New Roman" w:hAnsi="Times New Roman" w:cs="Times New Roman"/>
+        </w:rPr>
+        <w:t>)</w:t>
+      </w:r>
+      <w:r>
+        <w:rPr>
+          <w:rFonts w:ascii="Times New Roman" w:hAnsi="Times New Roman" w:cs="Times New Roman"/>
+        </w:rPr>
+        <w:t>,</w:t>
+      </w:r>
+      <w:r>
+        <w:rPr>
+          <w:rFonts w:ascii="Times New Roman" w:hAnsi="Times New Roman" w:cs="Times New Roman"/>
+        </w:rPr>
+        <w:t xml:space="preserve"> cell and tissue culture,</w:t>
+      </w:r>
+      <w:r>
+        <w:rPr>
+          <w:rFonts w:ascii="Times New Roman" w:hAnsi="Times New Roman" w:cs="Times New Roman"/>
+        </w:rPr>
+        <w:t xml:space="preserve"> </w:t>
+      </w:r>
+      <w:r>
+        <w:rPr>
+          <w:rFonts w:ascii="Times New Roman" w:hAnsi="Times New Roman" w:cs="Times New Roman"/>
+        </w:rPr>
+        <w:t xml:space="preserve">and </w:t>
+      </w:r>
+      <w:r>
+        <w:rPr>
+          <w:rFonts w:ascii="Times New Roman" w:hAnsi="Times New Roman" w:cs="Times New Roman"/>
+        </w:rPr>
+        <w:t>immunohistochemistry.</w:t>
       </w:r>
     </w:p>
     <w:p>
@@ -127,117 +351,91 @@
         <w:rPr>
           <w:rFonts w:ascii="Times New Roman" w:hAnsi="Times New Roman" w:cs="Times New Roman"/>
         </w:rPr>
-        <w:t>Throughout my education, I have received a</w:t>
-      </w:r>
-      <w:r>
-        <w:rPr>
-          <w:rFonts w:ascii="Times New Roman" w:hAnsi="Times New Roman" w:cs="Times New Roman"/>
-        </w:rPr>
-        <w:t xml:space="preserve"> strong </w:t>
-      </w:r>
-      <w:r>
-        <w:rPr>
-          <w:rFonts w:ascii="Times New Roman" w:hAnsi="Times New Roman" w:cs="Times New Roman"/>
-        </w:rPr>
-        <w:t>academic foundation and training in laboratory techniques central to molecular</w:t>
-      </w:r>
-      <w:r>
-        <w:rPr>
-          <w:rFonts w:ascii="Times New Roman" w:hAnsi="Times New Roman" w:cs="Times New Roman"/>
-        </w:rPr>
-        <w:t xml:space="preserve"> </w:t>
-      </w:r>
-      <w:r>
-        <w:rPr>
-          <w:rFonts w:ascii="Times New Roman" w:hAnsi="Times New Roman" w:cs="Times New Roman"/>
-        </w:rPr>
-        <w:t xml:space="preserve">biology, genome analysis, and physiology. During my </w:t>
-      </w:r>
-      <w:proofErr w:type="gramStart"/>
-      <w:r>
-        <w:rPr>
-          <w:rFonts w:ascii="Times New Roman" w:hAnsi="Times New Roman" w:cs="Times New Roman"/>
-        </w:rPr>
-        <w:t>Bachelor’s</w:t>
-      </w:r>
-      <w:proofErr w:type="gramEnd"/>
-      <w:r>
-        <w:rPr>
-          <w:rFonts w:ascii="Times New Roman" w:hAnsi="Times New Roman" w:cs="Times New Roman"/>
-        </w:rPr>
-        <w:t xml:space="preserve"> at Lomonosov Moscow State University</w:t>
-      </w:r>
-      <w:r>
-        <w:rPr>
-          <w:rFonts w:ascii="Times New Roman" w:hAnsi="Times New Roman" w:cs="Times New Roman"/>
-        </w:rPr>
-        <w:t xml:space="preserve"> (MSU)</w:t>
-      </w:r>
-      <w:r>
-        <w:rPr>
-          <w:rFonts w:ascii="Times New Roman" w:hAnsi="Times New Roman" w:cs="Times New Roman"/>
-        </w:rPr>
-        <w:t xml:space="preserve">, I built a </w:t>
-      </w:r>
-      <w:r>
-        <w:rPr>
-          <w:rFonts w:ascii="Times New Roman" w:hAnsi="Times New Roman" w:cs="Times New Roman"/>
-        </w:rPr>
-        <w:t xml:space="preserve">solid </w:t>
-      </w:r>
-      <w:r>
-        <w:rPr>
-          <w:rFonts w:ascii="Times New Roman" w:hAnsi="Times New Roman" w:cs="Times New Roman"/>
-        </w:rPr>
-        <w:t>skillset in wet lab methods, including PCR, gel electrophoresis, DNA/RNA extraction, ELISA,</w:t>
-      </w:r>
-      <w:r>
-        <w:rPr>
-          <w:rFonts w:ascii="Times New Roman" w:hAnsi="Times New Roman" w:cs="Times New Roman"/>
-        </w:rPr>
-        <w:t xml:space="preserve"> microscopy,</w:t>
-      </w:r>
-      <w:r>
-        <w:rPr>
-          <w:rFonts w:ascii="Times New Roman" w:hAnsi="Times New Roman" w:cs="Times New Roman"/>
-        </w:rPr>
-        <w:t xml:space="preserve"> immunohistochemistry, intracellular recordings, and behavioural testing in </w:t>
-      </w:r>
-      <w:r>
-        <w:rPr>
-          <w:rFonts w:ascii="Times New Roman" w:hAnsi="Times New Roman" w:cs="Times New Roman"/>
-        </w:rPr>
-        <w:t>rodent</w:t>
-      </w:r>
-      <w:r>
-        <w:rPr>
-          <w:rFonts w:ascii="Times New Roman" w:hAnsi="Times New Roman" w:cs="Times New Roman"/>
-        </w:rPr>
-        <w:t xml:space="preserve"> models</w:t>
-      </w:r>
-      <w:r>
-        <w:rPr>
-          <w:rFonts w:ascii="Times New Roman" w:hAnsi="Times New Roman" w:cs="Times New Roman"/>
-        </w:rPr>
-        <w:t xml:space="preserve">. </w:t>
-      </w:r>
-      <w:r>
-        <w:rPr>
-          <w:rFonts w:ascii="Times New Roman" w:hAnsi="Times New Roman" w:cs="Times New Roman"/>
-        </w:rPr>
-        <w:t xml:space="preserve">My practical experience in physiology and molecular biology was deepened during my year-long role as a Junior Research Assistant at Lomonosov MSU. There, I investigated the role of acid-sensitive two-pore potassium channels (TASK-1) in the vascular tone in rat arteries under varying pH conditions. This involved wire myography, RNA extraction, qPCR, and statistical analysis. Combined with my experience at the </w:t>
-      </w:r>
-      <w:r>
-        <w:rPr>
-          <w:rFonts w:ascii="Times New Roman" w:hAnsi="Times New Roman" w:cs="Times New Roman"/>
-        </w:rPr>
-        <w:t xml:space="preserve">LABMGMU </w:t>
-      </w:r>
-      <w:r>
-        <w:rPr>
-          <w:rFonts w:ascii="Times New Roman" w:hAnsi="Times New Roman" w:cs="Times New Roman"/>
-        </w:rPr>
-        <w:t>Contract Research Organization, this experience trained me to work independently in the lab, collaborate across interdisciplinary teams, and communicate findings through both publication and presentation, while also strengthening my documentation and project management skills</w:t>
+        <w:t xml:space="preserve">During one of my BSc research projects, I studied the </w:t>
+      </w:r>
+      <w:r>
+        <w:rPr>
+          <w:rFonts w:ascii="Times New Roman" w:hAnsi="Times New Roman" w:cs="Times New Roman"/>
+        </w:rPr>
+        <w:t>potassium</w:t>
+      </w:r>
+      <w:r>
+        <w:rPr>
+          <w:rFonts w:ascii="Times New Roman" w:hAnsi="Times New Roman" w:cs="Times New Roman"/>
+        </w:rPr>
+        <w:t xml:space="preserve"> channels of fish cardiomyocytes via the whole</w:t>
+      </w:r>
+      <w:r>
+        <w:rPr>
+          <w:rFonts w:ascii="Times New Roman" w:hAnsi="Times New Roman" w:cs="Times New Roman"/>
+        </w:rPr>
+        <w:t>-</w:t>
+      </w:r>
+      <w:r>
+        <w:rPr>
+          <w:rFonts w:ascii="Times New Roman" w:hAnsi="Times New Roman" w:cs="Times New Roman"/>
+        </w:rPr>
+        <w:t xml:space="preserve">cell patch clamp technique. For my BSc thesis and later as a Junior Research Assistant in the same laboratory, I </w:t>
+      </w:r>
+      <w:r>
+        <w:rPr>
+          <w:rFonts w:ascii="Times New Roman" w:hAnsi="Times New Roman" w:cs="Times New Roman"/>
+        </w:rPr>
+        <w:t>studied t</w:t>
+      </w:r>
+      <w:r>
+        <w:rPr>
+          <w:rFonts w:ascii="Times New Roman" w:hAnsi="Times New Roman" w:cs="Times New Roman"/>
+        </w:rPr>
+        <w:t>he role of acid-sensitive two-pore potassium channels (TASK-1) in the vascular tone</w:t>
+      </w:r>
+      <w:r>
+        <w:rPr>
+          <w:rFonts w:ascii="Times New Roman" w:hAnsi="Times New Roman" w:cs="Times New Roman"/>
+        </w:rPr>
+        <w:t xml:space="preserve"> regulation</w:t>
+      </w:r>
+      <w:r>
+        <w:rPr>
+          <w:rFonts w:ascii="Times New Roman" w:hAnsi="Times New Roman" w:cs="Times New Roman"/>
+        </w:rPr>
+        <w:t xml:space="preserve"> in rat arteries</w:t>
+      </w:r>
+      <w:r>
+        <w:rPr>
+          <w:rFonts w:ascii="Times New Roman" w:hAnsi="Times New Roman" w:cs="Times New Roman"/>
+        </w:rPr>
+        <w:t xml:space="preserve"> using the wire myography</w:t>
+      </w:r>
+      <w:r>
+        <w:rPr>
+          <w:rFonts w:ascii="Times New Roman" w:hAnsi="Times New Roman" w:cs="Times New Roman"/>
+        </w:rPr>
+        <w:t xml:space="preserve">, </w:t>
+      </w:r>
+      <w:r>
+        <w:rPr>
+          <w:rFonts w:ascii="Times New Roman" w:hAnsi="Times New Roman" w:cs="Times New Roman"/>
+        </w:rPr>
+        <w:t>RNA extraction, and qPCR</w:t>
+      </w:r>
+      <w:r>
+        <w:rPr>
+          <w:rFonts w:ascii="Times New Roman" w:hAnsi="Times New Roman" w:cs="Times New Roman"/>
+        </w:rPr>
+        <w:t xml:space="preserve">. Both patch clamp and wire myography are techniques that require </w:t>
+      </w:r>
+      <w:r>
+        <w:rPr>
+          <w:rFonts w:ascii="Times New Roman" w:hAnsi="Times New Roman" w:cs="Times New Roman"/>
+        </w:rPr>
+        <w:t xml:space="preserve">fine motor skills and </w:t>
+      </w:r>
+      <w:r>
+        <w:rPr>
+          <w:rFonts w:ascii="Times New Roman" w:hAnsi="Times New Roman" w:cs="Times New Roman"/>
+        </w:rPr>
+        <w:t>careful handling under the microscope, experience that I believe translates well to embryologic micromanipulation such as IVF</w:t>
       </w:r>
       <w:r>
         <w:rPr>
@@ -252,34 +450,73 @@
         <w:jc w:val="both"/>
         <w:rPr>
           <w:rFonts w:ascii="Times New Roman" w:hAnsi="Times New Roman" w:cs="Times New Roman"/>
-          <w:highlight w:val="yellow"/>
-        </w:rPr>
-      </w:pPr>
-      <w:r>
-        <w:rPr>
-          <w:rFonts w:ascii="Times New Roman" w:hAnsi="Times New Roman" w:cs="Times New Roman"/>
-        </w:rPr>
-        <w:t xml:space="preserve">Motivated to gain international experience, I was awarded an Orange Tulip scholarship to study a </w:t>
-      </w:r>
-      <w:proofErr w:type="gramStart"/>
-      <w:r>
-        <w:rPr>
-          <w:rFonts w:ascii="Times New Roman" w:hAnsi="Times New Roman" w:cs="Times New Roman"/>
-        </w:rPr>
-        <w:t>Master’s in Medical Biology</w:t>
-      </w:r>
-      <w:proofErr w:type="gramEnd"/>
-      <w:r>
-        <w:rPr>
-          <w:rFonts w:ascii="Times New Roman" w:hAnsi="Times New Roman" w:cs="Times New Roman"/>
-        </w:rPr>
-        <w:t xml:space="preserve"> at Radboud University. As a part of this program, I completed a 6-month research internship at the Donders Institute, where I quick</w:t>
-      </w:r>
-      <w:r>
-        <w:rPr>
-          <w:rFonts w:ascii="Times New Roman" w:hAnsi="Times New Roman" w:cs="Times New Roman"/>
-        </w:rPr>
-        <w:t xml:space="preserve">ly learned to operate a complex two-photon calcium imaging setup and successfully conducted </w:t>
+        </w:rPr>
+      </w:pPr>
+      <w:r>
+        <w:rPr>
+          <w:rFonts w:ascii="Times New Roman" w:hAnsi="Times New Roman" w:cs="Times New Roman"/>
+        </w:rPr>
+        <w:t>I am a team player and fast learner; during my</w:t>
+      </w:r>
+      <w:r>
+        <w:rPr>
+          <w:rFonts w:ascii="Times New Roman" w:hAnsi="Times New Roman" w:cs="Times New Roman"/>
+        </w:rPr>
+        <w:t xml:space="preserve"> </w:t>
+      </w:r>
+      <w:r>
+        <w:rPr>
+          <w:rFonts w:ascii="Times New Roman" w:hAnsi="Times New Roman" w:cs="Times New Roman"/>
+        </w:rPr>
+        <w:t>MSc</w:t>
+      </w:r>
+      <w:r>
+        <w:rPr>
+          <w:rFonts w:ascii="Times New Roman" w:hAnsi="Times New Roman" w:cs="Times New Roman"/>
+        </w:rPr>
+        <w:t xml:space="preserve"> internship at the Donders Institute, </w:t>
+      </w:r>
+      <w:r>
+        <w:rPr>
+          <w:rFonts w:ascii="Times New Roman" w:hAnsi="Times New Roman" w:cs="Times New Roman"/>
+        </w:rPr>
+        <w:t>I</w:t>
+      </w:r>
+      <w:r>
+        <w:rPr>
+          <w:rFonts w:ascii="Times New Roman" w:hAnsi="Times New Roman" w:cs="Times New Roman"/>
+        </w:rPr>
+        <w:t xml:space="preserve"> quick</w:t>
+      </w:r>
+      <w:r>
+        <w:rPr>
+          <w:rFonts w:ascii="Times New Roman" w:hAnsi="Times New Roman" w:cs="Times New Roman"/>
+        </w:rPr>
+        <w:t xml:space="preserve">ly learned to operate a complex two-photon calcium imaging setup and </w:t>
+      </w:r>
+      <w:r>
+        <w:rPr>
+          <w:rFonts w:ascii="Times New Roman" w:hAnsi="Times New Roman" w:cs="Times New Roman"/>
+        </w:rPr>
+        <w:t xml:space="preserve">was </w:t>
+      </w:r>
+      <w:r>
+        <w:rPr>
+          <w:rFonts w:ascii="Times New Roman" w:hAnsi="Times New Roman" w:cs="Times New Roman"/>
+        </w:rPr>
+        <w:t>conduct</w:t>
+      </w:r>
+      <w:r>
+        <w:rPr>
+          <w:rFonts w:ascii="Times New Roman" w:hAnsi="Times New Roman" w:cs="Times New Roman"/>
+        </w:rPr>
+        <w:t>ing</w:t>
+      </w:r>
+      <w:r>
+        <w:rPr>
+          <w:rFonts w:ascii="Times New Roman" w:hAnsi="Times New Roman" w:cs="Times New Roman"/>
+        </w:rPr>
+        <w:t xml:space="preserve"> </w:t>
       </w:r>
       <w:r>
         <w:rPr>
@@ -295,6 +532,60 @@
         </w:rPr>
         <w:t xml:space="preserve"> experiments investigating social fear learning in mice. This experience enhanced my adaptability, precision, and capacity to handle technically demanding systems in a fast-paced environment.</w:t>
       </w:r>
+      <w:r>
+        <w:rPr>
+          <w:rFonts w:ascii="Times New Roman" w:hAnsi="Times New Roman" w:cs="Times New Roman"/>
+        </w:rPr>
+        <w:t xml:space="preserve"> My </w:t>
+      </w:r>
+      <w:r>
+        <w:rPr>
+          <w:rFonts w:ascii="Times New Roman" w:hAnsi="Times New Roman" w:cs="Times New Roman"/>
+        </w:rPr>
+        <w:t>time</w:t>
+      </w:r>
+      <w:r>
+        <w:rPr>
+          <w:rFonts w:ascii="Times New Roman" w:hAnsi="Times New Roman" w:cs="Times New Roman"/>
+        </w:rPr>
+        <w:t xml:space="preserve"> as the Junior Research Assistant also taught me how to </w:t>
+      </w:r>
+      <w:r>
+        <w:rPr>
+          <w:rFonts w:ascii="Times New Roman" w:hAnsi="Times New Roman" w:cs="Times New Roman"/>
+        </w:rPr>
+        <w:t xml:space="preserve">collaborate across interdisciplinary </w:t>
+      </w:r>
+      <w:r>
+        <w:rPr>
+          <w:rFonts w:ascii="Times New Roman" w:hAnsi="Times New Roman" w:cs="Times New Roman"/>
+        </w:rPr>
+        <w:t>teams and</w:t>
+      </w:r>
+      <w:r>
+        <w:rPr>
+          <w:rFonts w:ascii="Times New Roman" w:hAnsi="Times New Roman" w:cs="Times New Roman"/>
+        </w:rPr>
+        <w:t xml:space="preserve"> communicate </w:t>
+      </w:r>
+      <w:r>
+        <w:rPr>
+          <w:rFonts w:ascii="Times New Roman" w:hAnsi="Times New Roman" w:cs="Times New Roman"/>
+        </w:rPr>
+        <w:t>results effectively</w:t>
+      </w:r>
+      <w:r>
+        <w:rPr>
+          <w:rFonts w:ascii="Times New Roman" w:hAnsi="Times New Roman" w:cs="Times New Roman"/>
+        </w:rPr>
+        <w:t xml:space="preserve"> through both publication and presentation</w:t>
+      </w:r>
+      <w:r>
+        <w:rPr>
+          <w:rFonts w:ascii="Times New Roman" w:hAnsi="Times New Roman" w:cs="Times New Roman"/>
+        </w:rPr>
+        <w:t>.</w:t>
+      </w:r>
     </w:p>
     <w:p>
       <w:pPr>
@@ -308,45 +599,61 @@
         <w:rPr>
           <w:rFonts w:ascii="Times New Roman" w:hAnsi="Times New Roman" w:cs="Times New Roman"/>
         </w:rPr>
-        <w:t>While I have long been fascinated by the physiology of horses, I was unaware</w:t>
-      </w:r>
-      <w:r>
-        <w:rPr>
-          <w:rFonts w:ascii="Times New Roman" w:hAnsi="Times New Roman" w:cs="Times New Roman"/>
-        </w:rPr>
-        <w:t xml:space="preserve"> – </w:t>
-      </w:r>
-      <w:r>
-        <w:rPr>
-          <w:rFonts w:ascii="Times New Roman" w:hAnsi="Times New Roman" w:cs="Times New Roman"/>
-        </w:rPr>
-        <w:t>having grown up in Russia</w:t>
-      </w:r>
-      <w:r>
-        <w:rPr>
-          <w:rFonts w:ascii="Times New Roman" w:hAnsi="Times New Roman" w:cs="Times New Roman"/>
-        </w:rPr>
-        <w:t xml:space="preserve"> – </w:t>
-      </w:r>
-      <w:proofErr w:type="gramStart"/>
-      <w:r>
-        <w:rPr>
-          <w:rFonts w:ascii="Times New Roman" w:hAnsi="Times New Roman" w:cs="Times New Roman"/>
-        </w:rPr>
-        <w:t>that equine sciences</w:t>
-      </w:r>
-      <w:proofErr w:type="gramEnd"/>
-      <w:r>
-        <w:rPr>
-          <w:rFonts w:ascii="Times New Roman" w:hAnsi="Times New Roman" w:cs="Times New Roman"/>
-        </w:rPr>
-        <w:t xml:space="preserve"> existed as a dedicated research field uniting molecular, cellular, and embryological approaches using equine models</w:t>
-      </w:r>
-      <w:r>
-        <w:rPr>
-          <w:rFonts w:ascii="Times New Roman" w:hAnsi="Times New Roman" w:cs="Times New Roman"/>
-        </w:rPr>
-        <w:t xml:space="preserve">. Discovering this PhD opportunity was a revelation, as it integrates my passion for equine </w:t>
+        <w:t xml:space="preserve">Discovering this </w:t>
+      </w:r>
+      <w:r>
+        <w:rPr>
+          <w:rFonts w:ascii="Times New Roman" w:hAnsi="Times New Roman" w:cs="Times New Roman"/>
+        </w:rPr>
+        <w:t xml:space="preserve">exciting </w:t>
+      </w:r>
+      <w:r>
+        <w:rPr>
+          <w:rFonts w:ascii="Times New Roman" w:hAnsi="Times New Roman" w:cs="Times New Roman"/>
+        </w:rPr>
+        <w:t xml:space="preserve">PhD opportunity </w:t>
+      </w:r>
+      <w:r>
+        <w:rPr>
+          <w:rFonts w:ascii="Times New Roman" w:hAnsi="Times New Roman" w:cs="Times New Roman"/>
+        </w:rPr>
+        <w:t>felt like</w:t>
+      </w:r>
+      <w:r>
+        <w:rPr>
+          <w:rFonts w:ascii="Times New Roman" w:hAnsi="Times New Roman" w:cs="Times New Roman"/>
+        </w:rPr>
+        <w:t xml:space="preserve"> a revelation</w:t>
+      </w:r>
+      <w:r>
+        <w:rPr>
+          <w:rFonts w:ascii="Times New Roman" w:hAnsi="Times New Roman" w:cs="Times New Roman"/>
+        </w:rPr>
+        <w:t xml:space="preserve"> because it </w:t>
+      </w:r>
+      <w:r>
+        <w:rPr>
+          <w:rFonts w:ascii="Times New Roman" w:hAnsi="Times New Roman" w:cs="Times New Roman"/>
+        </w:rPr>
+        <w:t>brings together</w:t>
+      </w:r>
+      <w:r>
+        <w:rPr>
+          <w:rFonts w:ascii="Times New Roman" w:hAnsi="Times New Roman" w:cs="Times New Roman"/>
+        </w:rPr>
+        <w:t xml:space="preserve"> my passion for </w:t>
+      </w:r>
+      <w:r>
+        <w:rPr>
+          <w:rFonts w:ascii="Times New Roman" w:hAnsi="Times New Roman" w:cs="Times New Roman"/>
+        </w:rPr>
+        <w:t>animal</w:t>
+      </w:r>
+      <w:r>
+        <w:rPr>
+          <w:rFonts w:ascii="Times New Roman" w:hAnsi="Times New Roman" w:cs="Times New Roman"/>
+        </w:rPr>
+        <w:t xml:space="preserve"> </w:t>
       </w:r>
       <w:r>
         <w:rPr>
@@ -358,13 +665,31 @@
         <w:rPr>
           <w:rFonts w:ascii="Times New Roman" w:hAnsi="Times New Roman" w:cs="Times New Roman"/>
         </w:rPr>
-        <w:t xml:space="preserve"> with my ambition to build </w:t>
-      </w:r>
-      <w:r>
-        <w:rPr>
-          <w:rFonts w:ascii="Times New Roman" w:hAnsi="Times New Roman" w:cs="Times New Roman"/>
-        </w:rPr>
-        <w:t>a career in translational science</w:t>
+        <w:t xml:space="preserve"> </w:t>
+      </w:r>
+      <w:r>
+        <w:rPr>
+          <w:rFonts w:ascii="Times New Roman" w:hAnsi="Times New Roman" w:cs="Times New Roman"/>
+        </w:rPr>
+        <w:t>and</w:t>
+      </w:r>
+      <w:r>
+        <w:rPr>
+          <w:rFonts w:ascii="Times New Roman" w:hAnsi="Times New Roman" w:cs="Times New Roman"/>
+        </w:rPr>
+        <w:t xml:space="preserve"> my ambition </w:t>
+      </w:r>
+      <w:r>
+        <w:rPr>
+          <w:rFonts w:ascii="Times New Roman" w:hAnsi="Times New Roman" w:cs="Times New Roman"/>
+        </w:rPr>
+        <w:t>to contribute to</w:t>
+      </w:r>
+      <w:r>
+        <w:rPr>
+          <w:rFonts w:ascii="Times New Roman" w:hAnsi="Times New Roman" w:cs="Times New Roman"/>
+        </w:rPr>
+        <w:t xml:space="preserve"> translational science</w:t>
       </w:r>
       <w:r>
         <w:rPr>
@@ -436,37 +761,7 @@
         <w:rPr>
           <w:rFonts w:ascii="Times New Roman" w:hAnsi="Times New Roman" w:cs="Times New Roman"/>
         </w:rPr>
-        <w:t xml:space="preserve">. </w:t>
-      </w:r>
-      <w:r>
-        <w:rPr>
-          <w:rFonts w:ascii="Times New Roman" w:hAnsi="Times New Roman" w:cs="Times New Roman"/>
-        </w:rPr>
-        <w:t xml:space="preserve">The integration of </w:t>
-      </w:r>
-      <w:r>
-        <w:rPr>
-          <w:rFonts w:ascii="Times New Roman" w:hAnsi="Times New Roman" w:cs="Times New Roman"/>
-        </w:rPr>
-        <w:t>clinical activities</w:t>
-      </w:r>
-      <w:r>
-        <w:rPr>
-          <w:rFonts w:ascii="Times New Roman" w:hAnsi="Times New Roman" w:cs="Times New Roman"/>
-        </w:rPr>
-        <w:t xml:space="preserve"> and </w:t>
-      </w:r>
-      <w:r>
-        <w:rPr>
-          <w:rFonts w:ascii="Times New Roman" w:hAnsi="Times New Roman" w:cs="Times New Roman"/>
-        </w:rPr>
-        <w:t>aneuploidy research</w:t>
-      </w:r>
-      <w:r>
-        <w:rPr>
-          <w:rFonts w:ascii="Times New Roman" w:hAnsi="Times New Roman" w:cs="Times New Roman"/>
-        </w:rPr>
-        <w:t>, along</w:t>
+        <w:t>. The integration of clinical activities and aneuploidy research, along</w:t>
       </w:r>
       <w:r>
         <w:rPr>
@@ -478,7 +773,19 @@
         <w:rPr>
           <w:rFonts w:ascii="Times New Roman" w:hAnsi="Times New Roman" w:cs="Times New Roman"/>
         </w:rPr>
-        <w:t xml:space="preserve"> state-of-the-art imaging and sequencing technologies, makes this project both innovative and highly impactful</w:t>
+        <w:t xml:space="preserve"> state-of-the-art imaging and sequencing technologies, makes this project </w:t>
+      </w:r>
+      <w:r>
+        <w:rPr>
+          <w:rFonts w:ascii="Times New Roman" w:hAnsi="Times New Roman" w:cs="Times New Roman"/>
+        </w:rPr>
+        <w:t>highly</w:t>
+      </w:r>
+      <w:r>
+        <w:rPr>
+          <w:rFonts w:ascii="Times New Roman" w:hAnsi="Times New Roman" w:cs="Times New Roman"/>
+        </w:rPr>
+        <w:t xml:space="preserve"> appealing to me, and I would love to be a part of it</w:t>
       </w:r>
       <w:r>
         <w:rPr>
@@ -499,7 +806,31 @@
         <w:rPr>
           <w:rFonts w:ascii="Times New Roman" w:hAnsi="Times New Roman" w:cs="Times New Roman"/>
         </w:rPr>
-        <w:t xml:space="preserve">Finally, I thrive when helping others and strongly value knowledge sharing. </w:t>
+        <w:t>I am proficient</w:t>
+      </w:r>
+      <w:r>
+        <w:rPr>
+          <w:rFonts w:ascii="Times New Roman" w:hAnsi="Times New Roman" w:cs="Times New Roman"/>
+        </w:rPr>
+        <w:t xml:space="preserve"> in written and spoken English</w:t>
+      </w:r>
+      <w:r>
+        <w:rPr>
+          <w:rFonts w:ascii="Times New Roman" w:hAnsi="Times New Roman" w:cs="Times New Roman"/>
+        </w:rPr>
+        <w:t>, have basic French and German skills, and am actively improving my Dutch knowledge.</w:t>
+      </w:r>
+      <w:r>
+        <w:rPr>
+          <w:rFonts w:ascii="Times New Roman" w:hAnsi="Times New Roman" w:cs="Times New Roman"/>
+        </w:rPr>
+        <w:t xml:space="preserve"> </w:t>
+      </w:r>
+      <w:r>
+        <w:rPr>
+          <w:rFonts w:ascii="Times New Roman" w:hAnsi="Times New Roman" w:cs="Times New Roman"/>
+        </w:rPr>
+        <w:t xml:space="preserve">I thrive when helping others and strongly value knowledge sharing. </w:t>
       </w:r>
       <w:r>
         <w:rPr>
@@ -517,19 +848,13 @@
         <w:rPr>
           <w:rFonts w:ascii="Times New Roman" w:hAnsi="Times New Roman" w:cs="Times New Roman"/>
         </w:rPr>
-        <w:t xml:space="preserve">I am very excited about contributing to </w:t>
-      </w:r>
-      <w:r>
-        <w:rPr>
-          <w:rFonts w:ascii="Times New Roman" w:hAnsi="Times New Roman" w:cs="Times New Roman"/>
-        </w:rPr>
-        <w:t>teaching activities</w:t>
-      </w:r>
-      <w:r>
-        <w:rPr>
-          <w:rFonts w:ascii="Times New Roman" w:hAnsi="Times New Roman" w:cs="Times New Roman"/>
-        </w:rPr>
-        <w:t xml:space="preserve"> within this PhD</w:t>
+        <w:t xml:space="preserve">I am very excited about </w:t>
+      </w:r>
+      <w:r>
+        <w:rPr>
+          <w:rFonts w:ascii="Times New Roman" w:hAnsi="Times New Roman" w:cs="Times New Roman"/>
+        </w:rPr>
+        <w:t>the opportunity to take part in teaching during this PhD</w:t>
       </w:r>
       <w:r>
         <w:rPr>
@@ -547,7 +872,19 @@
         <w:rPr>
           <w:rFonts w:ascii="Times New Roman" w:hAnsi="Times New Roman" w:cs="Times New Roman"/>
         </w:rPr>
-        <w:t>I also look forward to being part of the Utrecht Graduate School of Life Sciences, which I see as a valuable platform for both academic and professional development</w:t>
+        <w:t>I also look forward to being part of the Utrecht Graduate School of Life Sciences, which I see as a</w:t>
+      </w:r>
+      <w:r>
+        <w:rPr>
+          <w:rFonts w:ascii="Times New Roman" w:hAnsi="Times New Roman" w:cs="Times New Roman"/>
+        </w:rPr>
+        <w:t xml:space="preserve">n excellent </w:t>
+      </w:r>
+      <w:r>
+        <w:rPr>
+          <w:rFonts w:ascii="Times New Roman" w:hAnsi="Times New Roman" w:cs="Times New Roman"/>
+        </w:rPr>
+        <w:t>platform for both academic and professional development</w:t>
       </w:r>
       <w:r>
         <w:rPr>
@@ -568,7 +905,25 @@
         <w:rPr>
           <w:rFonts w:ascii="Times New Roman" w:hAnsi="Times New Roman" w:cs="Times New Roman"/>
         </w:rPr>
-        <w:t xml:space="preserve">I am confident that my interdisciplinary training, </w:t>
+        <w:t>To sum up,</w:t>
+      </w:r>
+      <w:r>
+        <w:rPr>
+          <w:rFonts w:ascii="Times New Roman" w:hAnsi="Times New Roman" w:cs="Times New Roman"/>
+        </w:rPr>
+        <w:t xml:space="preserve"> </w:t>
+      </w:r>
+      <w:r>
+        <w:rPr>
+          <w:rFonts w:ascii="Times New Roman" w:hAnsi="Times New Roman" w:cs="Times New Roman"/>
+        </w:rPr>
+        <w:t xml:space="preserve">I hope that </w:t>
+      </w:r>
+      <w:r>
+        <w:rPr>
+          <w:rFonts w:ascii="Times New Roman" w:hAnsi="Times New Roman" w:cs="Times New Roman"/>
+        </w:rPr>
+        <w:t xml:space="preserve">my interdisciplinary training, </w:t>
       </w:r>
       <w:r>
         <w:rPr>
@@ -580,7 +935,19 @@
         <w:rPr>
           <w:rFonts w:ascii="Times New Roman" w:hAnsi="Times New Roman" w:cs="Times New Roman"/>
         </w:rPr>
-        <w:t xml:space="preserve"> lab experience, and dedication to research and education make me a strong candidate for this position. I would be hono</w:t>
+        <w:t xml:space="preserve"> lab experience, and dedication to research and education make me a </w:t>
+      </w:r>
+      <w:r>
+        <w:rPr>
+          <w:rFonts w:ascii="Times New Roman" w:hAnsi="Times New Roman" w:cs="Times New Roman"/>
+        </w:rPr>
+        <w:t>worthy</w:t>
+      </w:r>
+      <w:r>
+        <w:rPr>
+          <w:rFonts w:ascii="Times New Roman" w:hAnsi="Times New Roman" w:cs="Times New Roman"/>
+        </w:rPr>
+        <w:t xml:space="preserve"> candidate for this position. I would be hono</w:t>
       </w:r>
       <w:r>
         <w:rPr>
@@ -649,6 +1016,605 @@
           <w:rFonts w:ascii="Times New Roman" w:hAnsi="Times New Roman" w:cs="Times New Roman"/>
         </w:rPr>
         <w:t>Varvara Lazarenko</w:t>
+      </w:r>
+    </w:p>
+    <w:p>
+      <w:pPr>
+        <w:pStyle w:val="ListParagraph"/>
+        <w:numPr>
+          <w:ilvl w:val="0"/>
+          <w:numId w:val="3"/>
+        </w:numPr>
+        <w:spacing w:before="240" w:after="240"/>
+        <w:jc w:val="both"/>
+        <w:rPr>
+          <w:rFonts w:ascii="Times New Roman" w:hAnsi="Times New Roman" w:cs="Times New Roman"/>
+        </w:rPr>
+      </w:pPr>
+      <w:r>
+        <w:rPr>
+          <w:rFonts w:ascii="Times New Roman" w:hAnsi="Times New Roman" w:cs="Times New Roman"/>
+        </w:rPr>
+        <w:t>+</w:t>
+      </w:r>
+      <w:r>
+        <w:rPr>
+          <w:rFonts w:ascii="Times New Roman" w:hAnsi="Times New Roman" w:cs="Times New Roman"/>
+        </w:rPr>
+        <w:t xml:space="preserve">I hold a </w:t>
+      </w:r>
+      <w:proofErr w:type="gramStart"/>
+      <w:r>
+        <w:rPr>
+          <w:rFonts w:ascii="Times New Roman" w:hAnsi="Times New Roman" w:cs="Times New Roman"/>
+        </w:rPr>
+        <w:t>Master’s degree in Medical biology</w:t>
+      </w:r>
+      <w:proofErr w:type="gramEnd"/>
+    </w:p>
+    <w:p>
+      <w:pPr>
+        <w:pStyle w:val="ListParagraph"/>
+        <w:numPr>
+          <w:ilvl w:val="0"/>
+          <w:numId w:val="3"/>
+        </w:numPr>
+        <w:jc w:val="both"/>
+        <w:rPr>
+          <w:rFonts w:ascii="Times New Roman" w:hAnsi="Times New Roman" w:cs="Times New Roman"/>
+        </w:rPr>
+      </w:pPr>
+      <w:r>
+        <w:rPr>
+          <w:rFonts w:ascii="Times New Roman" w:hAnsi="Times New Roman" w:cs="Times New Roman"/>
+        </w:rPr>
+        <w:lastRenderedPageBreak/>
+        <w:t>+</w:t>
+      </w:r>
+      <w:r>
+        <w:rPr>
+          <w:rFonts w:ascii="Times New Roman" w:hAnsi="Times New Roman" w:cs="Times New Roman"/>
+        </w:rPr>
+        <w:t xml:space="preserve">I have experience in </w:t>
+      </w:r>
+      <w:r>
+        <w:rPr>
+          <w:rFonts w:ascii="Times New Roman" w:hAnsi="Times New Roman" w:cs="Times New Roman"/>
+          <w:b/>
+          <w:bCs/>
+        </w:rPr>
+        <w:t>molecular biology and genetics</w:t>
+      </w:r>
+      <w:r>
+        <w:rPr>
+          <w:rFonts w:ascii="Times New Roman" w:hAnsi="Times New Roman" w:cs="Times New Roman"/>
+        </w:rPr>
+        <w:t xml:space="preserve">, and I have skills in </w:t>
+      </w:r>
+      <w:r>
+        <w:rPr>
+          <w:rFonts w:ascii="Times New Roman" w:hAnsi="Times New Roman" w:cs="Times New Roman"/>
+          <w:b/>
+          <w:bCs/>
+        </w:rPr>
+        <w:t>biomolecular</w:t>
+      </w:r>
+      <w:r>
+        <w:rPr>
+          <w:rFonts w:ascii="Times New Roman" w:hAnsi="Times New Roman" w:cs="Times New Roman"/>
+        </w:rPr>
+        <w:t xml:space="preserve">, </w:t>
+      </w:r>
+      <w:r>
+        <w:rPr>
+          <w:rFonts w:ascii="Times New Roman" w:hAnsi="Times New Roman" w:cs="Times New Roman"/>
+          <w:b/>
+          <w:bCs/>
+        </w:rPr>
+        <w:t>biochemical</w:t>
+      </w:r>
+      <w:r>
+        <w:rPr>
+          <w:rFonts w:ascii="Times New Roman" w:hAnsi="Times New Roman" w:cs="Times New Roman"/>
+        </w:rPr>
+        <w:t xml:space="preserve">, and </w:t>
+      </w:r>
+      <w:r>
+        <w:rPr>
+          <w:rFonts w:ascii="Times New Roman" w:hAnsi="Times New Roman" w:cs="Times New Roman"/>
+          <w:b/>
+          <w:bCs/>
+        </w:rPr>
+        <w:t>cell/tissue culture</w:t>
+      </w:r>
+      <w:r>
+        <w:rPr>
+          <w:rFonts w:ascii="Times New Roman" w:hAnsi="Times New Roman" w:cs="Times New Roman"/>
+        </w:rPr>
+        <w:t xml:space="preserve"> techniques.</w:t>
+      </w:r>
+    </w:p>
+    <w:p>
+      <w:pPr>
+        <w:pStyle w:val="ListParagraph"/>
+        <w:numPr>
+          <w:ilvl w:val="0"/>
+          <w:numId w:val="3"/>
+        </w:numPr>
+        <w:jc w:val="both"/>
+        <w:rPr>
+          <w:rFonts w:ascii="Times New Roman" w:hAnsi="Times New Roman" w:cs="Times New Roman"/>
+        </w:rPr>
+      </w:pPr>
+      <w:r>
+        <w:rPr>
+          <w:rFonts w:ascii="Times New Roman" w:hAnsi="Times New Roman" w:cs="Times New Roman"/>
+        </w:rPr>
+        <w:t>+</w:t>
+      </w:r>
+      <w:r>
+        <w:rPr>
+          <w:rFonts w:ascii="Times New Roman" w:hAnsi="Times New Roman" w:cs="Times New Roman"/>
+        </w:rPr>
+        <w:t>I am a team player, a fast learner, and thrive in a multidisciplinary environment.</w:t>
+      </w:r>
+    </w:p>
+    <w:p>
+      <w:pPr>
+        <w:pStyle w:val="ListParagraph"/>
+        <w:numPr>
+          <w:ilvl w:val="0"/>
+          <w:numId w:val="3"/>
+        </w:numPr>
+        <w:jc w:val="both"/>
+        <w:rPr>
+          <w:rFonts w:ascii="Times New Roman" w:hAnsi="Times New Roman" w:cs="Times New Roman"/>
+        </w:rPr>
+      </w:pPr>
+      <w:r>
+        <w:rPr>
+          <w:rFonts w:ascii="Times New Roman" w:hAnsi="Times New Roman" w:cs="Times New Roman"/>
+        </w:rPr>
+        <w:t>+-</w:t>
+      </w:r>
+      <w:r>
+        <w:rPr>
+          <w:rFonts w:ascii="Times New Roman" w:hAnsi="Times New Roman" w:cs="Times New Roman"/>
+        </w:rPr>
+        <w:t>I am enthusiastic, creative, and able to communicate effectively, promote collaboration, and think independently.</w:t>
+      </w:r>
+    </w:p>
+    <w:p>
+      <w:pPr>
+        <w:pStyle w:val="ListParagraph"/>
+        <w:numPr>
+          <w:ilvl w:val="0"/>
+          <w:numId w:val="3"/>
+        </w:numPr>
+        <w:jc w:val="both"/>
+        <w:rPr>
+          <w:rFonts w:ascii="Times New Roman" w:hAnsi="Times New Roman" w:cs="Times New Roman"/>
+        </w:rPr>
+      </w:pPr>
+      <w:r>
+        <w:rPr>
+          <w:rFonts w:ascii="Times New Roman" w:hAnsi="Times New Roman" w:cs="Times New Roman"/>
+        </w:rPr>
+        <w:t>+</w:t>
+      </w:r>
+      <w:r>
+        <w:rPr>
+          <w:rFonts w:ascii="Times New Roman" w:hAnsi="Times New Roman" w:cs="Times New Roman"/>
+        </w:rPr>
+        <w:t>I am knowledgeable in my field and am committed to staying up to date with recent advances in the literature.</w:t>
+      </w:r>
+    </w:p>
+    <w:p>
+      <w:pPr>
+        <w:pStyle w:val="ListParagraph"/>
+        <w:numPr>
+          <w:ilvl w:val="0"/>
+          <w:numId w:val="3"/>
+        </w:numPr>
+        <w:jc w:val="both"/>
+        <w:rPr>
+          <w:rFonts w:ascii="Times New Roman" w:hAnsi="Times New Roman" w:cs="Times New Roman"/>
+        </w:rPr>
+      </w:pPr>
+      <w:r>
+        <w:rPr>
+          <w:rFonts w:ascii="Times New Roman" w:hAnsi="Times New Roman" w:cs="Times New Roman"/>
+        </w:rPr>
+        <w:t>+</w:t>
+      </w:r>
+      <w:r>
+        <w:rPr>
+          <w:rFonts w:ascii="Times New Roman" w:hAnsi="Times New Roman" w:cs="Times New Roman"/>
+        </w:rPr>
+        <w:t>I am proficient in written and spoken English.</w:t>
+      </w:r>
+    </w:p>
+    <w:p>
+      <w:pPr>
+        <w:pStyle w:val="ListParagraph"/>
+        <w:numPr>
+          <w:ilvl w:val="0"/>
+          <w:numId w:val="3"/>
+        </w:numPr>
+        <w:spacing w:before="240" w:after="240"/>
+        <w:jc w:val="both"/>
+        <w:rPr>
+          <w:rFonts w:ascii="Times New Roman" w:hAnsi="Times New Roman" w:cs="Times New Roman"/>
+        </w:rPr>
+      </w:pPr>
+      <w:r>
+        <w:rPr>
+          <w:rFonts w:ascii="Times New Roman" w:hAnsi="Times New Roman" w:cs="Times New Roman"/>
+        </w:rPr>
+        <w:t>+</w:t>
+      </w:r>
+      <w:r>
+        <w:rPr>
+          <w:rFonts w:ascii="Times New Roman" w:hAnsi="Times New Roman" w:cs="Times New Roman"/>
+        </w:rPr>
+        <w:t>I have experience with micromanipulation techniques through wire myography</w:t>
+      </w:r>
+      <w:r>
+        <w:rPr>
+          <w:rFonts w:ascii="Times New Roman" w:hAnsi="Times New Roman" w:cs="Times New Roman"/>
+        </w:rPr>
+        <w:t xml:space="preserve"> and patch clamp.</w:t>
+      </w:r>
+    </w:p>
+    <w:p>
+      <w:pPr>
+        <w:jc w:val="both"/>
+        <w:rPr>
+          <w:rFonts w:ascii="Times New Roman" w:hAnsi="Times New Roman" w:cs="Times New Roman"/>
+        </w:rPr>
+      </w:pPr>
+    </w:p>
+    <w:p>
+      <w:pPr>
+        <w:pStyle w:val="ListParagraph"/>
+        <w:numPr>
+          <w:ilvl w:val="0"/>
+          <w:numId w:val="1"/>
+        </w:numPr>
+        <w:jc w:val="both"/>
+        <w:rPr>
+          <w:rFonts w:ascii="Times New Roman" w:hAnsi="Times New Roman" w:cs="Times New Roman"/>
+        </w:rPr>
+      </w:pPr>
+      <w:r>
+        <w:rPr>
+          <w:rFonts w:ascii="Times New Roman" w:hAnsi="Times New Roman" w:cs="Times New Roman"/>
+        </w:rPr>
+        <w:t>Add that I live in the NL</w:t>
+      </w:r>
+      <w:r>
+        <w:rPr>
+          <w:rFonts w:ascii="Times New Roman" w:hAnsi="Times New Roman" w:cs="Times New Roman"/>
+        </w:rPr>
+        <w:t xml:space="preserve"> in the motivation letter</w:t>
+      </w:r>
+    </w:p>
+    <w:p>
+      <w:pPr>
+        <w:pStyle w:val="ListParagraph"/>
+        <w:numPr>
+          <w:ilvl w:val="0"/>
+          <w:numId w:val="1"/>
+        </w:numPr>
+        <w:jc w:val="both"/>
+        <w:rPr>
+          <w:rFonts w:ascii="Times New Roman" w:hAnsi="Times New Roman" w:cs="Times New Roman"/>
+        </w:rPr>
+      </w:pPr>
+      <w:r>
+        <w:rPr>
+          <w:rFonts w:ascii="Times New Roman" w:hAnsi="Times New Roman" w:cs="Times New Roman"/>
+        </w:rPr>
+        <w:t xml:space="preserve">+ </w:t>
+      </w:r>
+      <w:r>
+        <w:rPr>
+          <w:rFonts w:ascii="Times New Roman" w:hAnsi="Times New Roman" w:cs="Times New Roman"/>
+        </w:rPr>
+        <w:t>Better words instead of ‘aspire to build a career’ animals people help.</w:t>
+      </w:r>
+      <w:r>
+        <w:rPr>
+          <w:rFonts w:ascii="Times New Roman" w:hAnsi="Times New Roman" w:cs="Times New Roman"/>
+        </w:rPr>
+        <w:t xml:space="preserve"> </w:t>
+      </w:r>
+    </w:p>
+    <w:p>
+      <w:pPr>
+        <w:pStyle w:val="ListParagraph"/>
+        <w:numPr>
+          <w:ilvl w:val="0"/>
+          <w:numId w:val="1"/>
+        </w:numPr>
+        <w:jc w:val="both"/>
+        <w:rPr>
+          <w:rFonts w:ascii="Times New Roman" w:hAnsi="Times New Roman" w:cs="Times New Roman"/>
+        </w:rPr>
+      </w:pPr>
+      <w:r>
+        <w:rPr>
+          <w:rFonts w:ascii="Times New Roman" w:hAnsi="Times New Roman" w:cs="Times New Roman"/>
+        </w:rPr>
+        <w:t xml:space="preserve">+ </w:t>
+      </w:r>
+      <w:r>
+        <w:rPr>
+          <w:rFonts w:ascii="Times New Roman" w:hAnsi="Times New Roman" w:cs="Times New Roman"/>
+        </w:rPr>
+        <w:t xml:space="preserve">Part-time job while searching for life sciences position </w:t>
+      </w:r>
+    </w:p>
+    <w:p>
+      <w:pPr>
+        <w:pStyle w:val="ListParagraph"/>
+        <w:numPr>
+          <w:ilvl w:val="0"/>
+          <w:numId w:val="1"/>
+        </w:numPr>
+        <w:jc w:val="both"/>
+        <w:rPr>
+          <w:rFonts w:ascii="Times New Roman" w:hAnsi="Times New Roman" w:cs="Times New Roman"/>
+        </w:rPr>
+      </w:pPr>
+      <w:r>
+        <w:rPr>
+          <w:rFonts w:ascii="Times New Roman" w:hAnsi="Times New Roman" w:cs="Times New Roman"/>
+        </w:rPr>
+        <w:t xml:space="preserve">+ </w:t>
+      </w:r>
+      <w:r>
+        <w:rPr>
+          <w:rFonts w:ascii="Times New Roman" w:hAnsi="Times New Roman" w:cs="Times New Roman"/>
+        </w:rPr>
+        <w:t>Decipher the certificates</w:t>
+      </w:r>
+    </w:p>
+    <w:p>
+      <w:pPr>
+        <w:pStyle w:val="ListParagraph"/>
+        <w:numPr>
+          <w:ilvl w:val="0"/>
+          <w:numId w:val="1"/>
+        </w:numPr>
+        <w:jc w:val="both"/>
+        <w:rPr>
+          <w:rFonts w:ascii="Times New Roman" w:hAnsi="Times New Roman" w:cs="Times New Roman"/>
+        </w:rPr>
+      </w:pPr>
+      <w:r>
+        <w:rPr>
+          <w:rFonts w:ascii="Times New Roman" w:hAnsi="Times New Roman" w:cs="Times New Roman"/>
+        </w:rPr>
+        <w:t xml:space="preserve">+ </w:t>
+      </w:r>
+      <w:r>
+        <w:rPr>
+          <w:rFonts w:ascii="Times New Roman" w:hAnsi="Times New Roman" w:cs="Times New Roman"/>
+        </w:rPr>
+        <w:t>Thesis</w:t>
+      </w:r>
+      <w:r>
+        <w:rPr>
+          <w:rFonts w:ascii="Times New Roman" w:hAnsi="Times New Roman" w:cs="Times New Roman"/>
+        </w:rPr>
+        <w:t xml:space="preserve"> add GPA</w:t>
+      </w:r>
+    </w:p>
+    <w:p>
+      <w:pPr>
+        <w:pStyle w:val="ListParagraph"/>
+        <w:numPr>
+          <w:ilvl w:val="0"/>
+          <w:numId w:val="1"/>
+        </w:numPr>
+        <w:jc w:val="both"/>
+        <w:rPr>
+          <w:rFonts w:ascii="Times New Roman" w:hAnsi="Times New Roman" w:cs="Times New Roman"/>
+        </w:rPr>
+      </w:pPr>
+      <w:r>
+        <w:rPr>
+          <w:rFonts w:ascii="Times New Roman" w:hAnsi="Times New Roman" w:cs="Times New Roman"/>
+        </w:rPr>
+        <w:t xml:space="preserve">+ Change the order in the cv </w:t>
+      </w:r>
+      <w:r>
+        <w:rPr>
+          <w:rFonts w:ascii="Times New Roman" w:hAnsi="Times New Roman" w:cs="Times New Roman"/>
+        </w:rPr>
+        <w:t>SCIENCE PUBL</w:t>
+      </w:r>
+    </w:p>
+    <w:p>
+      <w:pPr>
+        <w:pStyle w:val="ListParagraph"/>
+        <w:numPr>
+          <w:ilvl w:val="0"/>
+          <w:numId w:val="2"/>
+        </w:numPr>
+        <w:jc w:val="both"/>
+        <w:rPr>
+          <w:rFonts w:ascii="Times New Roman" w:hAnsi="Times New Roman" w:cs="Times New Roman"/>
+        </w:rPr>
+      </w:pPr>
+      <w:r>
+        <w:rPr>
+          <w:rFonts w:ascii="Times New Roman" w:hAnsi="Times New Roman" w:cs="Times New Roman"/>
+        </w:rPr>
+        <w:t>+</w:t>
+      </w:r>
+      <w:r>
+        <w:rPr>
+          <w:rFonts w:ascii="Times New Roman" w:hAnsi="Times New Roman" w:cs="Times New Roman"/>
+        </w:rPr>
+        <w:t>My life prof target interest</w:t>
+      </w:r>
+      <w:r>
+        <w:rPr>
+          <w:rFonts w:ascii="Times New Roman" w:hAnsi="Times New Roman" w:cs="Times New Roman"/>
+        </w:rPr>
+        <w:t xml:space="preserve">, aligns with an area I want to make value in. </w:t>
+      </w:r>
+      <w:r>
+        <w:rPr>
+          <w:rFonts w:ascii="Times New Roman" w:hAnsi="Times New Roman" w:cs="Times New Roman"/>
+        </w:rPr>
+        <w:t>Position – matches prof passion – I can provide value – and my foundation makes the background</w:t>
+      </w:r>
+    </w:p>
+    <w:p>
+      <w:pPr>
+        <w:pStyle w:val="ListParagraph"/>
+        <w:numPr>
+          <w:ilvl w:val="0"/>
+          <w:numId w:val="2"/>
+        </w:numPr>
+        <w:jc w:val="both"/>
+        <w:rPr>
+          <w:rFonts w:ascii="Times New Roman" w:hAnsi="Times New Roman" w:cs="Times New Roman"/>
+        </w:rPr>
+      </w:pPr>
+      <w:r>
+        <w:rPr>
+          <w:rFonts w:ascii="Times New Roman" w:hAnsi="Times New Roman" w:cs="Times New Roman"/>
+        </w:rPr>
+        <w:t>+</w:t>
+      </w:r>
+      <w:r>
+        <w:rPr>
+          <w:rFonts w:ascii="Times New Roman" w:hAnsi="Times New Roman" w:cs="Times New Roman"/>
+        </w:rPr>
+        <w:t xml:space="preserve">Paragraphs for the qualities, not one </w:t>
+      </w:r>
+    </w:p>
+    <w:p>
+      <w:pPr>
+        <w:pStyle w:val="ListParagraph"/>
+        <w:numPr>
+          <w:ilvl w:val="0"/>
+          <w:numId w:val="2"/>
+        </w:numPr>
+        <w:jc w:val="both"/>
+        <w:rPr>
+          <w:rFonts w:ascii="Times New Roman" w:hAnsi="Times New Roman" w:cs="Times New Roman"/>
+        </w:rPr>
+      </w:pPr>
+      <w:r>
+        <w:rPr>
+          <w:rFonts w:ascii="Times New Roman" w:hAnsi="Times New Roman" w:cs="Times New Roman"/>
+        </w:rPr>
+        <w:t>+</w:t>
+      </w:r>
+      <w:r>
+        <w:rPr>
+          <w:rFonts w:ascii="Times New Roman" w:hAnsi="Times New Roman" w:cs="Times New Roman"/>
+        </w:rPr>
+        <w:t>Micromanipulation as wire</w:t>
+      </w:r>
+      <w:r>
+        <w:rPr>
+          <w:rFonts w:ascii="Times New Roman" w:hAnsi="Times New Roman" w:cs="Times New Roman"/>
+        </w:rPr>
+        <w:t xml:space="preserve"> </w:t>
+      </w:r>
+      <w:r>
+        <w:rPr>
+          <w:rFonts w:ascii="Times New Roman" w:hAnsi="Times New Roman" w:cs="Times New Roman"/>
+        </w:rPr>
+        <w:t>myography</w:t>
+      </w:r>
+      <w:r>
+        <w:rPr>
+          <w:rFonts w:ascii="Times New Roman" w:hAnsi="Times New Roman" w:cs="Times New Roman"/>
+        </w:rPr>
+        <w:t xml:space="preserve"> experience</w:t>
+      </w:r>
+    </w:p>
+    <w:p>
+      <w:pPr>
+        <w:pStyle w:val="ListParagraph"/>
+        <w:numPr>
+          <w:ilvl w:val="0"/>
+          <w:numId w:val="2"/>
+        </w:numPr>
+        <w:jc w:val="both"/>
+        <w:rPr>
+          <w:rFonts w:ascii="Times New Roman" w:hAnsi="Times New Roman" w:cs="Times New Roman"/>
+        </w:rPr>
+      </w:pPr>
+      <w:r>
+        <w:rPr>
+          <w:rFonts w:ascii="Times New Roman" w:hAnsi="Times New Roman" w:cs="Times New Roman"/>
+        </w:rPr>
+        <w:t>Love with animals – childhood</w:t>
+      </w:r>
+    </w:p>
+    <w:p>
+      <w:pPr>
+        <w:pStyle w:val="ListParagraph"/>
+        <w:numPr>
+          <w:ilvl w:val="0"/>
+          <w:numId w:val="2"/>
+        </w:numPr>
+        <w:jc w:val="both"/>
+        <w:rPr>
+          <w:rFonts w:ascii="Times New Roman" w:hAnsi="Times New Roman" w:cs="Times New Roman"/>
+        </w:rPr>
+      </w:pPr>
+      <w:r>
+        <w:rPr>
+          <w:rFonts w:ascii="Times New Roman" w:hAnsi="Times New Roman" w:cs="Times New Roman"/>
+        </w:rPr>
+        <w:t>+</w:t>
+      </w:r>
+      <w:r>
+        <w:rPr>
+          <w:rFonts w:ascii="Times New Roman" w:hAnsi="Times New Roman" w:cs="Times New Roman"/>
+        </w:rPr>
+        <w:t>-</w:t>
+      </w:r>
+      <w:r>
+        <w:rPr>
+          <w:rFonts w:ascii="Times New Roman" w:hAnsi="Times New Roman" w:cs="Times New Roman"/>
+        </w:rPr>
+        <w:t xml:space="preserve">Too </w:t>
+      </w:r>
+      <w:r>
+        <w:rPr>
+          <w:rFonts w:ascii="Times New Roman" w:hAnsi="Times New Roman" w:cs="Times New Roman"/>
+        </w:rPr>
+        <w:t>Confident</w:t>
+      </w:r>
+      <w:r>
+        <w:rPr>
+          <w:rFonts w:ascii="Times New Roman" w:hAnsi="Times New Roman" w:cs="Times New Roman"/>
+        </w:rPr>
+        <w:t xml:space="preserve">, </w:t>
+      </w:r>
+      <w:proofErr w:type="gramStart"/>
+      <w:r>
+        <w:rPr>
+          <w:rFonts w:ascii="Times New Roman" w:hAnsi="Times New Roman" w:cs="Times New Roman"/>
+        </w:rPr>
+        <w:t>Have</w:t>
+      </w:r>
+      <w:proofErr w:type="gramEnd"/>
+      <w:r>
+        <w:rPr>
+          <w:rFonts w:ascii="Times New Roman" w:hAnsi="Times New Roman" w:cs="Times New Roman"/>
+        </w:rPr>
+        <w:t xml:space="preserve"> a chance to prove the ca</w:t>
       </w:r>
     </w:p>
     <w:sectPr>
@@ -659,6 +1625,359 @@
     </w:sectPr>
   </w:body>
 </w:document>
+</file>
+
+<file path=word/numbering.xml><?xml version="1.0" encoding="utf-8"?>
+<w:numbering xmlns:wpc="http://schemas.microsoft.com/office/word/2010/wordprocessingCanvas" xmlns:cx="http://schemas.microsoft.com/office/drawing/2014/chartex" xmlns:cx1="http://schemas.microsoft.com/office/drawing/2015/9/8/chartex" xmlns:cx2="http://schemas.microsoft.com/office/drawing/2015/10/21/chartex" xmlns:cx3="http://schemas.microsoft.com/office/drawing/2016/5/9/chartex" xmlns:cx4="http://schemas.microsoft.com/office/drawing/2016/5/10/chartex" xmlns:cx5="http://schemas.microsoft.com/office/drawing/2016/5/11/chartex" xmlns:cx6="http://schemas.microsoft.com/office/drawing/2016/5/12/chartex" xmlns:cx7="http://schemas.microsoft.com/office/drawing/2016/5/13/chartex" xmlns:cx8="http://schemas.microsoft.com/office/drawing/2016/5/14/chartex" xmlns:mc="http://schemas.openxmlformats.org/markup-compatibility/2006" xmlns:aink="http://schemas.microsoft.com/office/drawing/2016/ink" xmlns:am3d="http://schemas.microsoft.com/office/drawing/2017/model3d" xmlns:o="urn:schemas-microsoft-com:office:office" xmlns:oel="http://schemas.microsoft.com/office/2019/extlst" xmlns:r="http://schemas.openxmlformats.org/officeDocument/2006/relationships" xmlns:m="http://schemas.openxmlformats.org/officeDocument/2006/math" xmlns:v="urn:schemas-microsoft-com:vml" xmlns:wp14="http://schemas.microsoft.com/office/word/2010/wordprocessingDrawing" xmlns:wp="http://schemas.openxmlformats.org/drawingml/2006/wordprocessingDrawing" xmlns:w10="urn:schemas-microsoft-com:office:word" xmlns:w="http://schemas.openxmlformats.org/wordprocessingml/2006/main" xmlns:w14="http://schemas.microsoft.com/office/word/2010/wordml" xmlns:w15="http://schemas.microsoft.com/office/word/2012/wordml" xmlns:w16cex="http://schemas.microsoft.com/office/word/2018/wordml/cex" xmlns:w16cid="http://schemas.microsoft.com/office/word/2016/wordml/cid" xmlns:w16="http://schemas.microsoft.com/office/word/2018/wordml" xmlns:w16du="http://schemas.microsoft.com/office/word/2023/wordml/word16du" xmlns:w16sdtdh="http://schemas.microsoft.com/office/word/2020/wordml/sdtdatahash" xmlns:w16sdtfl="http://schemas.microsoft.com/office/word/2024/wordml/sdtformatlock" xmlns:w16se="http://schemas.microsoft.com/office/word/2015/wordml/symex" xmlns:wpg="http://schemas.microsoft.com/office/word/2010/wordprocessingGroup" xmlns:wpi="http://schemas.microsoft.com/office/word/2010/wordprocessingInk" xmlns:wne="http://schemas.microsoft.com/office/word/2006/wordml" xmlns:wps="http://schemas.microsoft.com/office/word/2010/wordprocessingShape" mc:Ignorable="w14 w15 w16se w16cid w16 w16cex w16sdtdh w16sdtfl w16du wp14">
+  <w:abstractNum w:abstractNumId="0" w15:restartNumberingAfterBreak="0">
+    <w:nsid w:val="253A4EDF"/>
+    <w:multiLevelType w:val="hybridMultilevel"/>
+    <w:tmpl w:val="024A2F02"/>
+    <w:lvl w:ilvl="0" w:tplc="20000001">
+      <w:start w:val="1"/>
+      <w:numFmt w:val="bullet"/>
+      <w:lvlText w:val=""/>
+      <w:lvlJc w:val="left"/>
+      <w:pPr>
+        <w:ind w:left="720" w:hanging="360"/>
+      </w:pPr>
+      <w:rPr>
+        <w:rFonts w:ascii="Symbol" w:hAnsi="Symbol" w:hint="default"/>
+      </w:rPr>
+    </w:lvl>
+    <w:lvl w:ilvl="1" w:tplc="20000003" w:tentative="1">
+      <w:start w:val="1"/>
+      <w:numFmt w:val="bullet"/>
+      <w:lvlText w:val="o"/>
+      <w:lvlJc w:val="left"/>
+      <w:pPr>
+        <w:ind w:left="1440" w:hanging="360"/>
+      </w:pPr>
+      <w:rPr>
+        <w:rFonts w:ascii="Courier New" w:hAnsi="Courier New" w:cs="Courier New" w:hint="default"/>
+      </w:rPr>
+    </w:lvl>
+    <w:lvl w:ilvl="2" w:tplc="20000005" w:tentative="1">
+      <w:start w:val="1"/>
+      <w:numFmt w:val="bullet"/>
+      <w:lvlText w:val=""/>
+      <w:lvlJc w:val="left"/>
+      <w:pPr>
+        <w:ind w:left="2160" w:hanging="360"/>
+      </w:pPr>
+      <w:rPr>
+        <w:rFonts w:ascii="Wingdings" w:hAnsi="Wingdings" w:hint="default"/>
+      </w:rPr>
+    </w:lvl>
+    <w:lvl w:ilvl="3" w:tplc="20000001" w:tentative="1">
+      <w:start w:val="1"/>
+      <w:numFmt w:val="bullet"/>
+      <w:lvlText w:val=""/>
+      <w:lvlJc w:val="left"/>
+      <w:pPr>
+        <w:ind w:left="2880" w:hanging="360"/>
+      </w:pPr>
+      <w:rPr>
+        <w:rFonts w:ascii="Symbol" w:hAnsi="Symbol" w:hint="default"/>
+      </w:rPr>
+    </w:lvl>
+    <w:lvl w:ilvl="4" w:tplc="20000003" w:tentative="1">
+      <w:start w:val="1"/>
+      <w:numFmt w:val="bullet"/>
+      <w:lvlText w:val="o"/>
+      <w:lvlJc w:val="left"/>
+      <w:pPr>
+        <w:ind w:left="3600" w:hanging="360"/>
+      </w:pPr>
+      <w:rPr>
+        <w:rFonts w:ascii="Courier New" w:hAnsi="Courier New" w:cs="Courier New" w:hint="default"/>
+      </w:rPr>
+    </w:lvl>
+    <w:lvl w:ilvl="5" w:tplc="20000005" w:tentative="1">
+      <w:start w:val="1"/>
+      <w:numFmt w:val="bullet"/>
+      <w:lvlText w:val=""/>
+      <w:lvlJc w:val="left"/>
+      <w:pPr>
+        <w:ind w:left="4320" w:hanging="360"/>
+      </w:pPr>
+      <w:rPr>
+        <w:rFonts w:ascii="Wingdings" w:hAnsi="Wingdings" w:hint="default"/>
+      </w:rPr>
+    </w:lvl>
+    <w:lvl w:ilvl="6" w:tplc="20000001" w:tentative="1">
+      <w:start w:val="1"/>
+      <w:numFmt w:val="bullet"/>
+      <w:lvlText w:val=""/>
+      <w:lvlJc w:val="left"/>
+      <w:pPr>
+        <w:ind w:left="5040" w:hanging="360"/>
+      </w:pPr>
+      <w:rPr>
+        <w:rFonts w:ascii="Symbol" w:hAnsi="Symbol" w:hint="default"/>
+      </w:rPr>
+    </w:lvl>
+    <w:lvl w:ilvl="7" w:tplc="20000003" w:tentative="1">
+      <w:start w:val="1"/>
+      <w:numFmt w:val="bullet"/>
+      <w:lvlText w:val="o"/>
+      <w:lvlJc w:val="left"/>
+      <w:pPr>
+        <w:ind w:left="5760" w:hanging="360"/>
+      </w:pPr>
+      <w:rPr>
+        <w:rFonts w:ascii="Courier New" w:hAnsi="Courier New" w:cs="Courier New" w:hint="default"/>
+      </w:rPr>
+    </w:lvl>
+    <w:lvl w:ilvl="8" w:tplc="20000005" w:tentative="1">
+      <w:start w:val="1"/>
+      <w:numFmt w:val="bullet"/>
+      <w:lvlText w:val=""/>
+      <w:lvlJc w:val="left"/>
+      <w:pPr>
+        <w:ind w:left="6480" w:hanging="360"/>
+      </w:pPr>
+      <w:rPr>
+        <w:rFonts w:ascii="Wingdings" w:hAnsi="Wingdings" w:hint="default"/>
+      </w:rPr>
+    </w:lvl>
+  </w:abstractNum>
+  <w:abstractNum w:abstractNumId="1" w15:restartNumberingAfterBreak="0">
+    <w:nsid w:val="288A7CE1"/>
+    <w:multiLevelType w:val="hybridMultilevel"/>
+    <w:tmpl w:val="38FA4662"/>
+    <w:lvl w:ilvl="0" w:tplc="20000001">
+      <w:start w:val="1"/>
+      <w:numFmt w:val="bullet"/>
+      <w:lvlText w:val=""/>
+      <w:lvlJc w:val="left"/>
+      <w:pPr>
+        <w:ind w:left="720" w:hanging="360"/>
+      </w:pPr>
+      <w:rPr>
+        <w:rFonts w:ascii="Symbol" w:hAnsi="Symbol" w:hint="default"/>
+      </w:rPr>
+    </w:lvl>
+    <w:lvl w:ilvl="1" w:tplc="20000003" w:tentative="1">
+      <w:start w:val="1"/>
+      <w:numFmt w:val="bullet"/>
+      <w:lvlText w:val="o"/>
+      <w:lvlJc w:val="left"/>
+      <w:pPr>
+        <w:ind w:left="1440" w:hanging="360"/>
+      </w:pPr>
+      <w:rPr>
+        <w:rFonts w:ascii="Courier New" w:hAnsi="Courier New" w:cs="Courier New" w:hint="default"/>
+      </w:rPr>
+    </w:lvl>
+    <w:lvl w:ilvl="2" w:tplc="20000005" w:tentative="1">
+      <w:start w:val="1"/>
+      <w:numFmt w:val="bullet"/>
+      <w:lvlText w:val=""/>
+      <w:lvlJc w:val="left"/>
+      <w:pPr>
+        <w:ind w:left="2160" w:hanging="360"/>
+      </w:pPr>
+      <w:rPr>
+        <w:rFonts w:ascii="Wingdings" w:hAnsi="Wingdings" w:hint="default"/>
+      </w:rPr>
+    </w:lvl>
+    <w:lvl w:ilvl="3" w:tplc="20000001" w:tentative="1">
+      <w:start w:val="1"/>
+      <w:numFmt w:val="bullet"/>
+      <w:lvlText w:val=""/>
+      <w:lvlJc w:val="left"/>
+      <w:pPr>
+        <w:ind w:left="2880" w:hanging="360"/>
+      </w:pPr>
+      <w:rPr>
+        <w:rFonts w:ascii="Symbol" w:hAnsi="Symbol" w:hint="default"/>
+      </w:rPr>
+    </w:lvl>
+    <w:lvl w:ilvl="4" w:tplc="20000003" w:tentative="1">
+      <w:start w:val="1"/>
+      <w:numFmt w:val="bullet"/>
+      <w:lvlText w:val="o"/>
+      <w:lvlJc w:val="left"/>
+      <w:pPr>
+        <w:ind w:left="3600" w:hanging="360"/>
+      </w:pPr>
+      <w:rPr>
+        <w:rFonts w:ascii="Courier New" w:hAnsi="Courier New" w:cs="Courier New" w:hint="default"/>
+      </w:rPr>
+    </w:lvl>
+    <w:lvl w:ilvl="5" w:tplc="20000005" w:tentative="1">
+      <w:start w:val="1"/>
+      <w:numFmt w:val="bullet"/>
+      <w:lvlText w:val=""/>
+      <w:lvlJc w:val="left"/>
+      <w:pPr>
+        <w:ind w:left="4320" w:hanging="360"/>
+      </w:pPr>
+      <w:rPr>
+        <w:rFonts w:ascii="Wingdings" w:hAnsi="Wingdings" w:hint="default"/>
+      </w:rPr>
+    </w:lvl>
+    <w:lvl w:ilvl="6" w:tplc="20000001" w:tentative="1">
+      <w:start w:val="1"/>
+      <w:numFmt w:val="bullet"/>
+      <w:lvlText w:val=""/>
+      <w:lvlJc w:val="left"/>
+      <w:pPr>
+        <w:ind w:left="5040" w:hanging="360"/>
+      </w:pPr>
+      <w:rPr>
+        <w:rFonts w:ascii="Symbol" w:hAnsi="Symbol" w:hint="default"/>
+      </w:rPr>
+    </w:lvl>
+    <w:lvl w:ilvl="7" w:tplc="20000003" w:tentative="1">
+      <w:start w:val="1"/>
+      <w:numFmt w:val="bullet"/>
+      <w:lvlText w:val="o"/>
+      <w:lvlJc w:val="left"/>
+      <w:pPr>
+        <w:ind w:left="5760" w:hanging="360"/>
+      </w:pPr>
+      <w:rPr>
+        <w:rFonts w:ascii="Courier New" w:hAnsi="Courier New" w:cs="Courier New" w:hint="default"/>
+      </w:rPr>
+    </w:lvl>
+    <w:lvl w:ilvl="8" w:tplc="20000005" w:tentative="1">
+      <w:start w:val="1"/>
+      <w:numFmt w:val="bullet"/>
+      <w:lvlText w:val=""/>
+      <w:lvlJc w:val="left"/>
+      <w:pPr>
+        <w:ind w:left="6480" w:hanging="360"/>
+      </w:pPr>
+      <w:rPr>
+        <w:rFonts w:ascii="Wingdings" w:hAnsi="Wingdings" w:hint="default"/>
+      </w:rPr>
+    </w:lvl>
+  </w:abstractNum>
+  <w:abstractNum w:abstractNumId="2" w15:restartNumberingAfterBreak="0">
+    <w:nsid w:val="79017474"/>
+    <w:multiLevelType w:val="hybridMultilevel"/>
+    <w:tmpl w:val="AA2CCB34"/>
+    <w:lvl w:ilvl="0" w:tplc="20000001">
+      <w:start w:val="1"/>
+      <w:numFmt w:val="bullet"/>
+      <w:lvlText w:val=""/>
+      <w:lvlJc w:val="left"/>
+      <w:pPr>
+        <w:ind w:left="720" w:hanging="360"/>
+      </w:pPr>
+      <w:rPr>
+        <w:rFonts w:ascii="Symbol" w:hAnsi="Symbol" w:hint="default"/>
+      </w:rPr>
+    </w:lvl>
+    <w:lvl w:ilvl="1" w:tplc="20000003" w:tentative="1">
+      <w:start w:val="1"/>
+      <w:numFmt w:val="bullet"/>
+      <w:lvlText w:val="o"/>
+      <w:lvlJc w:val="left"/>
+      <w:pPr>
+        <w:ind w:left="1440" w:hanging="360"/>
+      </w:pPr>
+      <w:rPr>
+        <w:rFonts w:ascii="Courier New" w:hAnsi="Courier New" w:cs="Courier New" w:hint="default"/>
+      </w:rPr>
+    </w:lvl>
+    <w:lvl w:ilvl="2" w:tplc="20000005" w:tentative="1">
+      <w:start w:val="1"/>
+      <w:numFmt w:val="bullet"/>
+      <w:lvlText w:val=""/>
+      <w:lvlJc w:val="left"/>
+      <w:pPr>
+        <w:ind w:left="2160" w:hanging="360"/>
+      </w:pPr>
+      <w:rPr>
+        <w:rFonts w:ascii="Wingdings" w:hAnsi="Wingdings" w:hint="default"/>
+      </w:rPr>
+    </w:lvl>
+    <w:lvl w:ilvl="3" w:tplc="20000001" w:tentative="1">
+      <w:start w:val="1"/>
+      <w:numFmt w:val="bullet"/>
+      <w:lvlText w:val=""/>
+      <w:lvlJc w:val="left"/>
+      <w:pPr>
+        <w:ind w:left="2880" w:hanging="360"/>
+      </w:pPr>
+      <w:rPr>
+        <w:rFonts w:ascii="Symbol" w:hAnsi="Symbol" w:hint="default"/>
+      </w:rPr>
+    </w:lvl>
+    <w:lvl w:ilvl="4" w:tplc="20000003" w:tentative="1">
+      <w:start w:val="1"/>
+      <w:numFmt w:val="bullet"/>
+      <w:lvlText w:val="o"/>
+      <w:lvlJc w:val="left"/>
+      <w:pPr>
+        <w:ind w:left="3600" w:hanging="360"/>
+      </w:pPr>
+      <w:rPr>
+        <w:rFonts w:ascii="Courier New" w:hAnsi="Courier New" w:cs="Courier New" w:hint="default"/>
+      </w:rPr>
+    </w:lvl>
+    <w:lvl w:ilvl="5" w:tplc="20000005" w:tentative="1">
+      <w:start w:val="1"/>
+      <w:numFmt w:val="bullet"/>
+      <w:lvlText w:val=""/>
+      <w:lvlJc w:val="left"/>
+      <w:pPr>
+        <w:ind w:left="4320" w:hanging="360"/>
+      </w:pPr>
+      <w:rPr>
+        <w:rFonts w:ascii="Wingdings" w:hAnsi="Wingdings" w:hint="default"/>
+      </w:rPr>
+    </w:lvl>
+    <w:lvl w:ilvl="6" w:tplc="20000001" w:tentative="1">
+      <w:start w:val="1"/>
+      <w:numFmt w:val="bullet"/>
+      <w:lvlText w:val=""/>
+      <w:lvlJc w:val="left"/>
+      <w:pPr>
+        <w:ind w:left="5040" w:hanging="360"/>
+      </w:pPr>
+      <w:rPr>
+        <w:rFonts w:ascii="Symbol" w:hAnsi="Symbol" w:hint="default"/>
+      </w:rPr>
+    </w:lvl>
+    <w:lvl w:ilvl="7" w:tplc="20000003" w:tentative="1">
+      <w:start w:val="1"/>
+      <w:numFmt w:val="bullet"/>
+      <w:lvlText w:val="o"/>
+      <w:lvlJc w:val="left"/>
+      <w:pPr>
+        <w:ind w:left="5760" w:hanging="360"/>
+      </w:pPr>
+      <w:rPr>
+        <w:rFonts w:ascii="Courier New" w:hAnsi="Courier New" w:cs="Courier New" w:hint="default"/>
+      </w:rPr>
+    </w:lvl>
+    <w:lvl w:ilvl="8" w:tplc="20000005" w:tentative="1">
+      <w:start w:val="1"/>
+      <w:numFmt w:val="bullet"/>
+      <w:lvlText w:val=""/>
+      <w:lvlJc w:val="left"/>
+      <w:pPr>
+        <w:ind w:left="6480" w:hanging="360"/>
+      </w:pPr>
+      <w:rPr>
+        <w:rFonts w:ascii="Wingdings" w:hAnsi="Wingdings" w:hint="default"/>
+      </w:rPr>
+    </w:lvl>
+  </w:abstractNum>
+  <w:num w:numId="1" w16cid:durableId="371732934">
+    <w:abstractNumId w:val="1"/>
+  </w:num>
+  <w:num w:numId="2" w16cid:durableId="197359339">
+    <w:abstractNumId w:val="2"/>
+  </w:num>
+  <w:num w:numId="3" w16cid:durableId="559098876">
+    <w:abstractNumId w:val="0"/>
+  </w:num>
+</w:numbering>
 </file>
 
 <file path=word/styles.xml><?xml version="1.0" encoding="utf-8"?>
@@ -1059,7 +2378,7 @@
   <w:style w:type="paragraph" w:default="1" w:styleId="Normal">
     <w:name w:val="Normal"/>
     <w:qFormat/>
-    <w:rsid w:val="00DD0CA0"/>
+    <w:rsid w:val="00EC553F"/>
   </w:style>
   <w:style w:type="paragraph" w:styleId="Heading1">
     <w:name w:val="heading 1"/>
@@ -1358,6 +2677,17 @@
       <w:color w:val="605E5C"/>
       <w:shd w:val="clear" w:color="auto" w:fill="E1DFDD"/>
     </w:rPr>
+  </w:style>
+  <w:style w:type="paragraph" w:styleId="ListParagraph">
+    <w:name w:val="List Paragraph"/>
+    <w:basedOn w:val="Normal"/>
+    <w:uiPriority w:val="34"/>
+    <w:qFormat/>
+    <w:rsid w:val="00A12622"/>
+    <w:pPr>
+      <w:ind w:left="720"/>
+      <w:contextualSpacing/>
+    </w:pPr>
   </w:style>
 </w:styles>
 </file>

</xml_diff>